<commit_message>
D-17 edited and sent for printing!
</commit_message>
<xml_diff>
--- a/Received/6/6, computer.docx
+++ b/Received/6/6, computer.docx
@@ -263,7 +263,6 @@
         </w:rPr>
         <w:t xml:space="preserve">Ratnanagar-7, </w:t>
       </w:r>
-      <w:proofErr w:type="spellStart"/>
       <w:proofErr w:type="gramStart"/>
       <w:r>
         <w:rPr>
@@ -274,7 +273,6 @@
         </w:rPr>
         <w:t>Sauraha</w:t>
       </w:r>
-      <w:proofErr w:type="spellEnd"/>
       <w:r>
         <w:rPr>
           <w:rFonts w:ascii="Times New Roman" w:hAnsi="Times New Roman"/>
@@ -403,7 +401,27 @@
           <w:sz w:val="24"/>
           <w:szCs w:val="24"/>
         </w:rPr>
-        <w:t>Time: 2 hrs.</w:t>
+        <w:t xml:space="preserve">Time: </w:t>
+      </w:r>
+      <w:r>
+        <w:rPr>
+          <w:rFonts w:ascii="Times New Roman" w:hAnsi="Times New Roman"/>
+          <w:b/>
+          <w:bCs/>
+          <w:sz w:val="24"/>
+          <w:szCs w:val="24"/>
+        </w:rPr>
+        <w:t>1</w:t>
+      </w:r>
+      <w:r>
+        <w:rPr>
+          <w:rFonts w:ascii="Times New Roman" w:hAnsi="Times New Roman"/>
+          <w:b/>
+          <w:bCs/>
+          <w:sz w:val="24"/>
+          <w:szCs w:val="24"/>
+        </w:rPr>
+        <w:t xml:space="preserve"> hr.</w:t>
       </w:r>
       <w:r>
         <w:rPr>
@@ -839,7 +857,6 @@
         </w:rPr>
         <w:t>​</w:t>
       </w:r>
-      <w:proofErr w:type="spellStart"/>
       <w:r>
         <w:rPr>
           <w:rFonts w:ascii="Times New Roman" w:hAnsi="Times New Roman" w:cs="Times New Roman"/>
@@ -848,7 +865,6 @@
         </w:rPr>
         <w:t>i</w:t>
       </w:r>
-      <w:proofErr w:type="spellEnd"/>
       <w:r>
         <w:rPr>
           <w:rFonts w:ascii="Times New Roman" w:hAnsi="Times New Roman" w:cs="Times New Roman"/>
@@ -1376,7 +1392,6 @@
         </w:rPr>
         <w:t xml:space="preserve">                                       Ratnanagar-7, </w:t>
       </w:r>
-      <w:proofErr w:type="spellStart"/>
       <w:proofErr w:type="gramStart"/>
       <w:r>
         <w:rPr>
@@ -1385,17 +1400,7 @@
           <w:bCs/>
           <w:sz w:val="20"/>
         </w:rPr>
-        <w:t>Sauraha</w:t>
-      </w:r>
-      <w:proofErr w:type="spellEnd"/>
-      <w:r>
-        <w:rPr>
-          <w:rFonts w:ascii="Times New Roman" w:hAnsi="Times New Roman"/>
-          <w:b/>
-          <w:bCs/>
-          <w:sz w:val="20"/>
-        </w:rPr>
-        <w:t xml:space="preserve"> ,</w:t>
+        <w:t>Sauraha ,</w:t>
       </w:r>
       <w:proofErr w:type="gramEnd"/>
       <w:r>
@@ -1507,7 +1512,27 @@
           <w:sz w:val="24"/>
           <w:szCs w:val="24"/>
         </w:rPr>
-        <w:t>Time: 2 hrs.</w:t>
+        <w:t xml:space="preserve">Time: </w:t>
+      </w:r>
+      <w:r>
+        <w:rPr>
+          <w:rFonts w:ascii="Times New Roman" w:hAnsi="Times New Roman"/>
+          <w:b/>
+          <w:bCs/>
+          <w:sz w:val="24"/>
+          <w:szCs w:val="24"/>
+        </w:rPr>
+        <w:t>1</w:t>
+      </w:r>
+      <w:r>
+        <w:rPr>
+          <w:rFonts w:ascii="Times New Roman" w:hAnsi="Times New Roman"/>
+          <w:b/>
+          <w:bCs/>
+          <w:sz w:val="24"/>
+          <w:szCs w:val="24"/>
+        </w:rPr>
+        <w:t xml:space="preserve"> hr.</w:t>
       </w:r>
       <w:r>
         <w:rPr>
@@ -1921,25 +1946,7 @@
           <w:sz w:val="28"/>
           <w:szCs w:val="28"/>
         </w:rPr>
-        <w:t>​</w:t>
-      </w:r>
-      <w:proofErr w:type="spellStart"/>
-      <w:r>
-        <w:rPr>
-          <w:rFonts w:ascii="Times New Roman" w:hAnsi="Times New Roman" w:cs="Times New Roman"/>
-          <w:sz w:val="28"/>
-          <w:szCs w:val="28"/>
-        </w:rPr>
-        <w:t>i</w:t>
-      </w:r>
-      <w:proofErr w:type="spellEnd"/>
-      <w:r>
-        <w:rPr>
-          <w:rFonts w:ascii="Times New Roman" w:hAnsi="Times New Roman" w:cs="Times New Roman"/>
-          <w:sz w:val="28"/>
-          <w:szCs w:val="28"/>
-        </w:rPr>
-        <w:t>. 1011 ×101</w:t>
+        <w:t>​i. 1011 ×101</w:t>
       </w:r>
     </w:p>
     <w:p>

</xml_diff>